<commit_message>
Prepare LABDA toolkit v1.0.0 release
</commit_message>
<xml_diff>
--- a/visualisation_catalogue/Visualisation_examples_catalogue.docx
+++ b/visualisation_catalogue/Visualisation_examples_catalogue.docx
@@ -32,7 +32,7 @@
           <w:color w:val="17212B"/>
           <w:sz w:val="20"/>
         </w:rPr>
-        <w:t>This document contains 32 generated visualisation examples: 9 worked case-study examples and 23 simulated data examples.</w:t>
+        <w:t>This document contains 32 generated visualisation examples: 9 application-to-a-published-study examples and 23 simulated data examples.</w:t>
       </w:r>
     </w:p>
     <w:p>
@@ -45,7 +45,7 @@
           <w:color w:val="17212B"/>
           <w:sz w:val="20"/>
         </w:rPr>
-        <w:t>Worked case-study examples were generated from the reproduced NHANES 2011-2014 case-study outputs. Simulated data examples were generated from small mock datasets to illustrate recommendation-specific visual structures and should not be interpreted as evidence that the designs have been empirically tested.</w:t>
+        <w:t>Application to a published study examples were generated from the reproduced NHANES 2011-2014 outputs reconstructed for the published-study application. Simulated data examples were generated from small mock datasets to illustrate recommendation-specific visual structures and should not be interpreted as evidence that the designs have been empirically tested.</w:t>
       </w:r>
     </w:p>
     <w:p>
@@ -61,7 +61,7 @@
         </w:pBdr>
       </w:pPr>
       <w:r>
-        <w:t>Worked case study examples</w:t>
+        <w:t>Application to a published study examples</w:t>
       </w:r>
     </w:p>
     <w:p>
@@ -70,7 +70,7 @@
           <w:color w:val="56636F"/>
           <w:sz w:val="20"/>
         </w:rPr>
-        <w:t>Figures generated from the reproduced NHANES case-study dataset and associated summary outputs.</w:t>
+        <w:t>Figures generated from the reconstructed NHANES dataset and associated summary outputs used in the published-study application.</w:t>
       </w:r>
     </w:p>
     <w:p>
@@ -78,7 +78,7 @@
         <w:pStyle w:val="Heading2"/>
       </w:pPr>
       <w:r>
-        <w:t>Worked example 1. Weekday and weekend-day physical activity by sample</w:t>
+        <w:t>Published-study application example 1. Weekday and weekend-day physical activity by sample</w:t>
       </w:r>
     </w:p>
     <w:p>
@@ -136,7 +136,7 @@
         <w:pStyle w:val="FigureSource"/>
       </w:pPr>
       <w:r>
-        <w:t>Source: Worked case study, reproduced NHANES 2011-2014 data.</w:t>
+        <w:t>Source: Application to a published study, reproduced NHANES 2011-2014 data.</w:t>
       </w:r>
     </w:p>
     <w:p>
@@ -149,7 +149,7 @@
         <w:pStyle w:val="Heading2"/>
       </w:pPr>
       <w:r>
-        <w:t>Worked example 2. Weekday-weekend physical activity difference by subgroup: Adults 20+</w:t>
+        <w:t>Published-study application example 2. Weekday-weekend physical activity difference by subgroup: Adults 20+</w:t>
       </w:r>
     </w:p>
     <w:p>
@@ -207,7 +207,7 @@
         <w:pStyle w:val="FigureSource"/>
       </w:pPr>
       <w:r>
-        <w:t>Source: Worked case study, reproduced NHANES 2011-2014 data.</w:t>
+        <w:t>Source: Application to a published study, reproduced NHANES 2011-2014 data.</w:t>
       </w:r>
     </w:p>
     <w:p>
@@ -220,7 +220,7 @@
         <w:pStyle w:val="Heading2"/>
       </w:pPr>
       <w:r>
-        <w:t>Worked example 3. Weekday-weekend physical activity difference by subgroup: Children/adolescents 6-19</w:t>
+        <w:t>Published-study application example 3. Weekday-weekend physical activity difference by subgroup: Children/adolescents 6-19</w:t>
       </w:r>
     </w:p>
     <w:p>
@@ -278,7 +278,7 @@
         <w:pStyle w:val="FigureSource"/>
       </w:pPr>
       <w:r>
-        <w:t>Source: Worked case study, reproduced NHANES 2011-2014 data.</w:t>
+        <w:t>Source: Application to a published study, reproduced NHANES 2011-2014 data.</w:t>
       </w:r>
     </w:p>
     <w:p>
@@ -291,7 +291,7 @@
         <w:pStyle w:val="Heading2"/>
       </w:pPr>
       <w:r>
-        <w:t>Worked example 4. Weekday and weekend-day physical activity by subgroup: Adults 20+</w:t>
+        <w:t>Published-study application example 4. Weekday and weekend-day physical activity by subgroup: Adults 20+</w:t>
       </w:r>
     </w:p>
     <w:p>
@@ -349,7 +349,7 @@
         <w:pStyle w:val="FigureSource"/>
       </w:pPr>
       <w:r>
-        <w:t>Source: Worked case study, reproduced NHANES 2011-2014 data.</w:t>
+        <w:t>Source: Application to a published study, reproduced NHANES 2011-2014 data.</w:t>
       </w:r>
     </w:p>
     <w:p>
@@ -362,7 +362,7 @@
         <w:pStyle w:val="Heading2"/>
       </w:pPr>
       <w:r>
-        <w:t>Worked example 5. Weekday and weekend-day physical activity by subgroup: Children/adolescents 6-19</w:t>
+        <w:t>Published-study application example 5. Weekday and weekend-day physical activity by subgroup: Children/adolescents 6-19</w:t>
       </w:r>
     </w:p>
     <w:p>
@@ -420,7 +420,7 @@
         <w:pStyle w:val="FigureSource"/>
       </w:pPr>
       <w:r>
-        <w:t>Source: Worked case study, reproduced NHANES 2011-2014 data.</w:t>
+        <w:t>Source: Application to a published study, reproduced NHANES 2011-2014 data.</w:t>
       </w:r>
     </w:p>
     <w:p>
@@ -433,7 +433,7 @@
         <w:pStyle w:val="Heading2"/>
       </w:pPr>
       <w:r>
-        <w:t>Worked example 6. Distribution of individual weekday-weekend differences</w:t>
+        <w:t>Published-study application example 6. Distribution of individual weekday-weekend differences</w:t>
       </w:r>
     </w:p>
     <w:p>
@@ -491,7 +491,7 @@
         <w:pStyle w:val="FigureSource"/>
       </w:pPr>
       <w:r>
-        <w:t>Source: Worked case study, reproduced NHANES 2011-2014 data.</w:t>
+        <w:t>Source: Application to a published study, reproduced NHANES 2011-2014 data.</w:t>
       </w:r>
     </w:p>
     <w:p>
@@ -504,7 +504,7 @@
         <w:pStyle w:val="Heading2"/>
       </w:pPr>
       <w:r>
-        <w:t>Worked example 7. Participant-level relationship between weekday and weekend-day activity</w:t>
+        <w:t>Published-study application example 7. Participant-level relationship between weekday and weekend-day activity</w:t>
       </w:r>
     </w:p>
     <w:p>
@@ -562,7 +562,7 @@
         <w:pStyle w:val="FigureSource"/>
       </w:pPr>
       <w:r>
-        <w:t>Source: Worked case study, reproduced NHANES 2011-2014 data.</w:t>
+        <w:t>Source: Application to a published study, reproduced NHANES 2011-2014 data.</w:t>
       </w:r>
     </w:p>
     <w:p>
@@ -575,7 +575,7 @@
         <w:pStyle w:val="Heading2"/>
       </w:pPr>
       <w:r>
-        <w:t>Worked example 8. Percentage weekday-weekend difference by sample</w:t>
+        <w:t>Published-study application example 8. Percentage weekday-weekend difference by sample</w:t>
       </w:r>
     </w:p>
     <w:p>
@@ -633,7 +633,7 @@
         <w:pStyle w:val="FigureSource"/>
       </w:pPr>
       <w:r>
-        <w:t>Source: Worked case study, reproduced NHANES 2011-2014 data.</w:t>
+        <w:t>Source: Application to a published study, reproduced NHANES 2011-2014 data.</w:t>
       </w:r>
     </w:p>
     <w:p>
@@ -646,7 +646,7 @@
         <w:pStyle w:val="Heading2"/>
       </w:pPr>
       <w:r>
-        <w:t>Worked example 9. Conditional bar-chart example: percentage difference by sample</w:t>
+        <w:t>Published-study application example 9. Conditional bar-chart example: percentage difference by sample</w:t>
       </w:r>
     </w:p>
     <w:p>
@@ -704,7 +704,7 @@
         <w:pStyle w:val="FigureSource"/>
       </w:pPr>
       <w:r>
-        <w:t>Source: Worked case study, reproduced NHANES 2011-2014 data.</w:t>
+        <w:t>Source: Application to a published study, reproduced NHANES 2011-2014 data.</w:t>
       </w:r>
     </w:p>
     <w:p>

</xml_diff>